<commit_message>
dijital_tema-2-kim11: gorsel alanlarina Shutter onizlemeleri yerlestirildi (2.3 bicimi)
</commit_message>
<xml_diff>
--- a/dijital/dijital_tema-2-kim11.docx
+++ b/dijital/dijital_tema-2-kim11.docx
@@ -470,114 +470,63 @@
         <w:t xml:space="preserve">Le Chatelier ilkesine göre koşulları değiştirilen bir denge sistemi, bu değişikliği kısmen karşılayan yönde kayar. Derişim, hacim (basınç) ve sıcaklık dengeyi kaydırabilir; denge sabitini yalnızca sıcaklık değiştirir. Katalizör dengeye daha kısa sürede ulaşılmasını sağlar ancak dengeyi kaydırmaz.</w:t>
       </w:r>
     </w:p>
-    <w:tbl>
-      <w:tblPr>
-        <w:tblW w:w="9000" w:type="dxa"/>
+    <w:p>
+      <w:pPr>
         <w:jc w:val="center"/>
-        <w:tblBorders>
-          <w:top w:val="single" w:sz="8" w:space="0" w:color="7F7F7F"/>
-          <w:left w:val="single" w:sz="8" w:space="0" w:color="7F7F7F"/>
-          <w:bottom w:val="single" w:sz="8" w:space="0" w:color="7F7F7F"/>
-          <w:right w:val="single" w:sz="8" w:space="0" w:color="7F7F7F"/>
-        </w:tblBorders>
-      </w:tblPr>
-      <w:tblGrid>
-        <w:gridCol w:w="9000"/>
-      </w:tblGrid>
-      <w:tr>
-        <w:tc>
-          <w:tcPr>
-            <w:tcW w:w="9000" w:type="dxa"/>
-            <w:shd w:val="clear" w:color="auto" w:fill="EDEDED"/>
-          </w:tcPr>
-          <w:p>
-            <w:pPr>
-              <w:jc w:val="both"/>
-              <w:rPr>
-                <w:rFonts w:ascii="Times New Roman" w:hAnsi="Times New Roman" w:cs="Times New Roman"/>
-                <w:lang w:val="tr-TR"/>
-              </w:rPr>
-            </w:pPr>
-            <w:r>
-              <w:rPr>
-                <w:rFonts w:ascii="Times New Roman" w:hAnsi="Times New Roman" w:cs="Times New Roman"/>
-                <w:lang w:val="tr-TR"/>
-              </w:rPr>
-              <w:t xml:space="preserve">GÖRSEL ALANI (Shutterstock)</w:t>
-            </w:r>
-          </w:p>
-          <w:p>
-            <w:pPr>
-              <w:jc w:val="both"/>
-              <w:rPr>
-                <w:rFonts w:ascii="Times New Roman" w:hAnsi="Times New Roman" w:cs="Times New Roman"/>
-                <w:lang w:val="tr-TR"/>
-              </w:rPr>
-            </w:pPr>
-            <w:r>
-              <w:rPr>
-                <w:rFonts w:ascii="Times New Roman" w:hAnsi="Times New Roman" w:cs="Times New Roman"/>
-                <w:lang w:val="tr-TR"/>
-              </w:rPr>
-              <w:t xml:space="preserve">Tarif: Bir terazi ya da tahterevalli benzetmesiyle dengeye madde eklenmesi ve sistemin karşı yöne kayması (vektörel infografik).</w:t>
-            </w:r>
-          </w:p>
-          <w:p>
-            <w:pPr>
-              <w:jc w:val="both"/>
-              <w:rPr>
-                <w:rFonts w:ascii="Times New Roman" w:hAnsi="Times New Roman" w:cs="Times New Roman"/>
-                <w:lang w:val="tr-TR"/>
-              </w:rPr>
-            </w:pPr>
-            <w:r>
-              <w:rPr>
-                <w:rFonts w:ascii="Times New Roman" w:hAnsi="Times New Roman" w:cs="Times New Roman"/>
-                <w:lang w:val="tr-TR"/>
-              </w:rPr>
-              <w:t xml:space="preserve">Shutter ID: 2328878629 (vektör) — Effects of stress factors on chemical equilibrium shifts</w:t>
-            </w:r>
-          </w:p>
-        </w:tc>
-      </w:tr>
-    </w:tbl>
-    <w:p>
-      <w:pPr>
-        <w:jc w:val="both"/>
-        <w:rPr>
-          <w:rFonts w:ascii="Times New Roman" w:hAnsi="Times New Roman" w:cs="Times New Roman"/>
-          <w:lang w:val="tr-TR"/>
-        </w:rPr>
-      </w:pPr>
+      </w:pPr>
+      <w:r>
+        <w:drawing>
+          <wp:inline xmlns:a="http://schemas.openxmlformats.org/drawingml/2006/main" xmlns:pic="http://schemas.openxmlformats.org/drawingml/2006/picture">
+            <wp:extent cx="1833300" cy="2520000"/>
+            <wp:docPr id="900005" name="Picture 900005"/>
+            <wp:cNvGraphicFramePr>
+              <a:graphicFrameLocks noChangeAspect="1"/>
+            </wp:cNvGraphicFramePr>
+            <a:graphic>
+              <a:graphicData uri="http://schemas.openxmlformats.org/drawingml/2006/picture">
+                <pic:pic>
+                  <pic:nvPicPr>
+                    <pic:cNvPr id="0" name="2328878629_d.jpg"/>
+                    <pic:cNvPicPr/>
+                  </pic:nvPicPr>
+                  <pic:blipFill>
+                    <a:blip r:embed="rId12"/>
+                    <a:stretch>
+                      <a:fillRect/>
+                    </a:stretch>
+                  </pic:blipFill>
+                  <pic:spPr>
+                    <a:xfrm>
+                      <a:off x="0" y="0"/>
+                      <a:ext cx="1833300" cy="2520000"/>
+                    </a:xfrm>
+                    <a:prstGeom prst="rect"/>
+                  </pic:spPr>
+                </pic:pic>
+              </a:graphicData>
+            </a:graphic>
+          </wp:inline>
+        </w:drawing>
+      </w:r>
     </w:p>
     <w:p>
       <w:pPr>
         <w:jc w:val="center"/>
-        <w:rPr>
-          <w:rFonts w:ascii="Times New Roman" w:hAnsi="Times New Roman" w:cs="Times New Roman"/>
-          <w:lang w:val="tr-TR"/>
-        </w:rPr>
       </w:pPr>
       <w:r>
         <w:rPr>
           <w:rFonts w:ascii="Times New Roman" w:hAnsi="Times New Roman" w:cs="Times New Roman"/>
           <w:b/>
           <w:bCs/>
-          <w:lang w:val="tr-TR"/>
-        </w:rPr>
-        <w:t xml:space="preserve">Görsel:</w:t>
-      </w:r>
-      <w:r>
-        <w:rPr>
-          <w:rFonts w:ascii="Times New Roman" w:hAnsi="Times New Roman" w:cs="Times New Roman"/>
-          <w:lang w:val="tr-TR"/>
-        </w:rPr>
-        <w:t xml:space="preserve"> Le Chatelier ilkesi infografiği</w:t>
-      </w:r>
-    </w:p>
-    <w:p>
-      <w:pPr>
-        <w:jc w:val="both"/>
+          <w:highlight w:val="yellow"/>
+          <w:lang w:val="tr-TR"/>
+        </w:rPr>
+        <w:t xml:space="preserve">Shutter id: 2328878629</w:t>
+      </w:r>
+    </w:p>
+    <w:p>
+      <w:pPr>
+        <w:jc w:val="center"/>
         <w:rPr>
           <w:rFonts w:ascii="Times New Roman" w:hAnsi="Times New Roman" w:cs="Times New Roman"/>
           <w:lang w:val="tr-TR"/>
@@ -590,333 +539,19 @@
           <w:bCs/>
           <w:lang w:val="tr-TR"/>
         </w:rPr>
-        <w:t xml:space="preserve">Bölüm: Asit ve Baz Çözeltilerinde Denge</w:t>
-      </w:r>
-    </w:p>
-    <w:p>
-      <w:pPr>
-        <w:jc w:val="both"/>
-        <w:rPr>
-          <w:rFonts w:ascii="Times New Roman" w:hAnsi="Times New Roman" w:cs="Times New Roman"/>
-          <w:lang w:val="tr-TR"/>
-        </w:rPr>
-      </w:pPr>
-      <w:r>
-        <w:rPr>
-          <w:rFonts w:ascii="Times New Roman" w:hAnsi="Times New Roman" w:cs="Times New Roman"/>
-          <w:lang w:val="tr-TR"/>
-        </w:rPr>
-        <w:t xml:space="preserve">Saf su çok az da olsa iyonlaşır: 2H</w:t>
-      </w:r>
-      <w:r>
-        <w:rPr>
-          <w:rFonts w:ascii="Times New Roman" w:hAnsi="Times New Roman" w:cs="Times New Roman"/>
-          <w:vertAlign w:val="subscript"/>
-          <w:lang w:val="tr-TR"/>
-        </w:rPr>
-        <w:t xml:space="preserve">2</w:t>
-      </w:r>
-      <w:r>
-        <w:rPr>
-          <w:rFonts w:ascii="Times New Roman" w:hAnsi="Times New Roman" w:cs="Times New Roman"/>
-          <w:lang w:val="tr-TR"/>
-        </w:rPr>
-        <w:t xml:space="preserve">O ⇌ H</w:t>
-      </w:r>
-      <w:r>
-        <w:rPr>
-          <w:rFonts w:ascii="Times New Roman" w:hAnsi="Times New Roman" w:cs="Times New Roman"/>
-          <w:vertAlign w:val="subscript"/>
-          <w:lang w:val="tr-TR"/>
-        </w:rPr>
-        <w:t xml:space="preserve">3</w:t>
-      </w:r>
-      <w:r>
-        <w:rPr>
-          <w:rFonts w:ascii="Times New Roman" w:hAnsi="Times New Roman" w:cs="Times New Roman"/>
-          <w:lang w:val="tr-TR"/>
-        </w:rPr>
-        <w:t xml:space="preserve">O</w:t>
-      </w:r>
-      <w:r>
-        <w:rPr>
-          <w:rFonts w:ascii="Times New Roman" w:hAnsi="Times New Roman" w:cs="Times New Roman"/>
-          <w:vertAlign w:val="superscript"/>
-          <w:lang w:val="tr-TR"/>
-        </w:rPr>
-        <w:t xml:space="preserve">+</w:t>
-      </w:r>
-      <w:r>
-        <w:rPr>
-          <w:rFonts w:ascii="Times New Roman" w:hAnsi="Times New Roman" w:cs="Times New Roman"/>
-          <w:lang w:val="tr-TR"/>
-        </w:rPr>
-        <w:t xml:space="preserve"> + OH</w:t>
-      </w:r>
-      <w:r>
-        <w:rPr>
-          <w:rFonts w:ascii="Times New Roman" w:hAnsi="Times New Roman" w:cs="Times New Roman"/>
-          <w:vertAlign w:val="superscript"/>
-          <w:lang w:val="tr-TR"/>
-        </w:rPr>
-        <w:t xml:space="preserve">−</w:t>
-      </w:r>
-      <w:r>
-        <w:rPr>
-          <w:rFonts w:ascii="Times New Roman" w:hAnsi="Times New Roman" w:cs="Times New Roman"/>
-          <w:lang w:val="tr-TR"/>
-        </w:rPr>
-        <w:t xml:space="preserve">. 25 °C’de K</w:t>
-      </w:r>
-      <w:r>
-        <w:rPr>
-          <w:rFonts w:ascii="Times New Roman" w:hAnsi="Times New Roman" w:cs="Times New Roman"/>
-          <w:vertAlign w:val="subscript"/>
-          <w:lang w:val="tr-TR"/>
-        </w:rPr>
-        <w:t xml:space="preserve">su</w:t>
-      </w:r>
-      <w:r>
-        <w:rPr>
-          <w:rFonts w:ascii="Times New Roman" w:hAnsi="Times New Roman" w:cs="Times New Roman"/>
-          <w:lang w:val="tr-TR"/>
-        </w:rPr>
-        <w:t xml:space="preserve"> = [H</w:t>
-      </w:r>
-      <w:r>
-        <w:rPr>
-          <w:rFonts w:ascii="Times New Roman" w:hAnsi="Times New Roman" w:cs="Times New Roman"/>
-          <w:vertAlign w:val="subscript"/>
-          <w:lang w:val="tr-TR"/>
-        </w:rPr>
-        <w:t xml:space="preserve">3</w:t>
-      </w:r>
-      <w:r>
-        <w:rPr>
-          <w:rFonts w:ascii="Times New Roman" w:hAnsi="Times New Roman" w:cs="Times New Roman"/>
-          <w:lang w:val="tr-TR"/>
-        </w:rPr>
-        <w:t xml:space="preserve">O</w:t>
-      </w:r>
-      <w:r>
-        <w:rPr>
-          <w:rFonts w:ascii="Times New Roman" w:hAnsi="Times New Roman" w:cs="Times New Roman"/>
-          <w:vertAlign w:val="superscript"/>
-          <w:lang w:val="tr-TR"/>
-        </w:rPr>
-        <w:t xml:space="preserve">+</w:t>
-      </w:r>
-      <w:r>
-        <w:rPr>
-          <w:rFonts w:ascii="Times New Roman" w:hAnsi="Times New Roman" w:cs="Times New Roman"/>
-          <w:lang w:val="tr-TR"/>
-        </w:rPr>
-        <w:t xml:space="preserve">][OH</w:t>
-      </w:r>
-      <w:r>
-        <w:rPr>
-          <w:rFonts w:ascii="Times New Roman" w:hAnsi="Times New Roman" w:cs="Times New Roman"/>
-          <w:vertAlign w:val="superscript"/>
-          <w:lang w:val="tr-TR"/>
-        </w:rPr>
-        <w:t xml:space="preserve">−</w:t>
-      </w:r>
-      <w:r>
-        <w:rPr>
-          <w:rFonts w:ascii="Times New Roman" w:hAnsi="Times New Roman" w:cs="Times New Roman"/>
-          <w:lang w:val="tr-TR"/>
-        </w:rPr>
-        <w:t xml:space="preserve">] = 1,0·10</w:t>
-      </w:r>
-      <w:r>
-        <w:rPr>
-          <w:rFonts w:ascii="Times New Roman" w:hAnsi="Times New Roman" w:cs="Times New Roman"/>
-          <w:vertAlign w:val="superscript"/>
-          <w:lang w:val="tr-TR"/>
-        </w:rPr>
-        <w:t xml:space="preserve">-14</w:t>
-      </w:r>
-      <w:r>
-        <w:rPr>
-          <w:rFonts w:ascii="Times New Roman" w:hAnsi="Times New Roman" w:cs="Times New Roman"/>
-          <w:lang w:val="tr-TR"/>
-        </w:rPr>
-        <w:t xml:space="preserve">’tür ve saf suda [H</w:t>
-      </w:r>
-      <w:r>
-        <w:rPr>
-          <w:rFonts w:ascii="Times New Roman" w:hAnsi="Times New Roman" w:cs="Times New Roman"/>
-          <w:vertAlign w:val="subscript"/>
-          <w:lang w:val="tr-TR"/>
-        </w:rPr>
-        <w:t xml:space="preserve">3</w:t>
-      </w:r>
-      <w:r>
-        <w:rPr>
-          <w:rFonts w:ascii="Times New Roman" w:hAnsi="Times New Roman" w:cs="Times New Roman"/>
-          <w:lang w:val="tr-TR"/>
-        </w:rPr>
-        <w:t xml:space="preserve">O</w:t>
-      </w:r>
-      <w:r>
-        <w:rPr>
-          <w:rFonts w:ascii="Times New Roman" w:hAnsi="Times New Roman" w:cs="Times New Roman"/>
-          <w:vertAlign w:val="superscript"/>
-          <w:lang w:val="tr-TR"/>
-        </w:rPr>
-        <w:t xml:space="preserve">+</w:t>
-      </w:r>
-      <w:r>
-        <w:rPr>
-          <w:rFonts w:ascii="Times New Roman" w:hAnsi="Times New Roman" w:cs="Times New Roman"/>
-          <w:lang w:val="tr-TR"/>
-        </w:rPr>
-        <w:t xml:space="preserve">] = [OH</w:t>
-      </w:r>
-      <w:r>
-        <w:rPr>
-          <w:rFonts w:ascii="Times New Roman" w:hAnsi="Times New Roman" w:cs="Times New Roman"/>
-          <w:vertAlign w:val="superscript"/>
-          <w:lang w:val="tr-TR"/>
-        </w:rPr>
-        <w:t xml:space="preserve">−</w:t>
-      </w:r>
-      <w:r>
-        <w:rPr>
-          <w:rFonts w:ascii="Times New Roman" w:hAnsi="Times New Roman" w:cs="Times New Roman"/>
-          <w:lang w:val="tr-TR"/>
-        </w:rPr>
-        <w:t xml:space="preserve">] = 1,0·10</w:t>
-      </w:r>
-      <w:r>
-        <w:rPr>
-          <w:rFonts w:ascii="Times New Roman" w:hAnsi="Times New Roman" w:cs="Times New Roman"/>
-          <w:vertAlign w:val="superscript"/>
-          <w:lang w:val="tr-TR"/>
-        </w:rPr>
-        <w:t xml:space="preserve">-7</w:t>
-      </w:r>
-      <w:r>
-        <w:rPr>
-          <w:rFonts w:ascii="Times New Roman" w:hAnsi="Times New Roman" w:cs="Times New Roman"/>
-          <w:lang w:val="tr-TR"/>
-        </w:rPr>
-        <w:t xml:space="preserve"> mol/L’dir. Çözeltilerin asitliği pH = −log[H</w:t>
-      </w:r>
-      <w:r>
-        <w:rPr>
-          <w:rFonts w:ascii="Times New Roman" w:hAnsi="Times New Roman" w:cs="Times New Roman"/>
-          <w:vertAlign w:val="subscript"/>
-          <w:lang w:val="tr-TR"/>
-        </w:rPr>
-        <w:t xml:space="preserve">3</w:t>
-      </w:r>
-      <w:r>
-        <w:rPr>
-          <w:rFonts w:ascii="Times New Roman" w:hAnsi="Times New Roman" w:cs="Times New Roman"/>
-          <w:lang w:val="tr-TR"/>
-        </w:rPr>
-        <w:t xml:space="preserve">O</w:t>
-      </w:r>
-      <w:r>
-        <w:rPr>
-          <w:rFonts w:ascii="Times New Roman" w:hAnsi="Times New Roman" w:cs="Times New Roman"/>
-          <w:vertAlign w:val="superscript"/>
-          <w:lang w:val="tr-TR"/>
-        </w:rPr>
-        <w:t xml:space="preserve">+</w:t>
-      </w:r>
-      <w:r>
-        <w:rPr>
-          <w:rFonts w:ascii="Times New Roman" w:hAnsi="Times New Roman" w:cs="Times New Roman"/>
-          <w:lang w:val="tr-TR"/>
-        </w:rPr>
-        <w:t xml:space="preserve">] ile ifade edilir; 25 °C’de pH + pOH = 14’tür.</w:t>
-      </w:r>
-    </w:p>
-    <w:tbl>
-      <w:tblPr>
-        <w:tblW w:w="9000" w:type="dxa"/>
-        <w:jc w:val="center"/>
-        <w:tblBorders>
-          <w:top w:val="single" w:sz="8" w:space="0" w:color="7F7F7F"/>
-          <w:left w:val="single" w:sz="8" w:space="0" w:color="7F7F7F"/>
-          <w:bottom w:val="single" w:sz="8" w:space="0" w:color="7F7F7F"/>
-          <w:right w:val="single" w:sz="8" w:space="0" w:color="7F7F7F"/>
-        </w:tblBorders>
-      </w:tblPr>
-      <w:tblGrid>
-        <w:gridCol w:w="9000"/>
-      </w:tblGrid>
-      <w:tr>
-        <w:tc>
-          <w:tcPr>
-            <w:tcW w:w="9000" w:type="dxa"/>
-            <w:shd w:val="clear" w:color="auto" w:fill="EDEDED"/>
-          </w:tcPr>
-          <w:p>
-            <w:pPr>
-              <w:jc w:val="both"/>
-              <w:rPr>
-                <w:rFonts w:ascii="Times New Roman" w:hAnsi="Times New Roman" w:cs="Times New Roman"/>
-                <w:lang w:val="tr-TR"/>
-              </w:rPr>
-            </w:pPr>
-            <w:r>
-              <w:rPr>
-                <w:rFonts w:ascii="Times New Roman" w:hAnsi="Times New Roman" w:cs="Times New Roman"/>
-                <w:lang w:val="tr-TR"/>
-              </w:rPr>
-              <w:t xml:space="preserve">GÖRSEL ALANI (Shutterstock)</w:t>
-            </w:r>
-          </w:p>
-          <w:p>
-            <w:pPr>
-              <w:jc w:val="both"/>
-              <w:rPr>
-                <w:rFonts w:ascii="Times New Roman" w:hAnsi="Times New Roman" w:cs="Times New Roman"/>
-                <w:lang w:val="tr-TR"/>
-              </w:rPr>
-            </w:pPr>
-            <w:r>
-              <w:rPr>
-                <w:rFonts w:ascii="Times New Roman" w:hAnsi="Times New Roman" w:cs="Times New Roman"/>
-                <w:lang w:val="tr-TR"/>
-              </w:rPr>
-              <w:t xml:space="preserve">Tarif: Günlük hayattan maddelerin yerleştirildiği renkli pH skalası (vektörel).</w:t>
-            </w:r>
-          </w:p>
-          <w:p>
-            <w:pPr>
-              <w:jc w:val="both"/>
-              <w:rPr>
-                <w:rFonts w:ascii="Times New Roman" w:hAnsi="Times New Roman" w:cs="Times New Roman"/>
-                <w:lang w:val="tr-TR"/>
-              </w:rPr>
-            </w:pPr>
-            <w:r>
-              <w:rPr>
-                <w:rFonts w:ascii="Times New Roman" w:hAnsi="Times New Roman" w:cs="Times New Roman"/>
-                <w:lang w:val="tr-TR"/>
-              </w:rPr>
-              <w:t xml:space="preserve">Shutter ID: 2715446197 (vektör) — pH scale diagram with acidic, neutral and alkaline ranges</w:t>
-            </w:r>
-          </w:p>
-        </w:tc>
-      </w:tr>
-    </w:tbl>
-    <w:p>
-      <w:pPr>
-        <w:jc w:val="both"/>
-        <w:rPr>
-          <w:rFonts w:ascii="Times New Roman" w:hAnsi="Times New Roman" w:cs="Times New Roman"/>
-          <w:lang w:val="tr-TR"/>
-        </w:rPr>
-      </w:pPr>
-    </w:p>
-    <w:p>
-      <w:pPr>
-        <w:jc w:val="center"/>
+        <w:t xml:space="preserve">Görsel:</w:t>
+      </w:r>
+      <w:r>
+        <w:rPr>
+          <w:rFonts w:ascii="Times New Roman" w:hAnsi="Times New Roman" w:cs="Times New Roman"/>
+          <w:lang w:val="tr-TR"/>
+        </w:rPr>
+        <w:t xml:space="preserve"> Le Chatelier ilkesi infografiği</w:t>
+      </w:r>
+    </w:p>
+    <w:p>
+      <w:pPr>
+        <w:jc w:val="both"/>
         <w:rPr>
           <w:rFonts w:ascii="Times New Roman" w:hAnsi="Times New Roman" w:cs="Times New Roman"/>
           <w:lang w:val="tr-TR"/>
@@ -929,6 +564,319 @@
           <w:bCs/>
           <w:lang w:val="tr-TR"/>
         </w:rPr>
+        <w:t xml:space="preserve">Bölüm: Asit ve Baz Çözeltilerinde Denge</w:t>
+      </w:r>
+    </w:p>
+    <w:p>
+      <w:pPr>
+        <w:jc w:val="both"/>
+        <w:rPr>
+          <w:rFonts w:ascii="Times New Roman" w:hAnsi="Times New Roman" w:cs="Times New Roman"/>
+          <w:lang w:val="tr-TR"/>
+        </w:rPr>
+      </w:pPr>
+      <w:r>
+        <w:rPr>
+          <w:rFonts w:ascii="Times New Roman" w:hAnsi="Times New Roman" w:cs="Times New Roman"/>
+          <w:lang w:val="tr-TR"/>
+        </w:rPr>
+        <w:t xml:space="preserve">Saf su çok az da olsa iyonlaşır: 2H</w:t>
+      </w:r>
+      <w:r>
+        <w:rPr>
+          <w:rFonts w:ascii="Times New Roman" w:hAnsi="Times New Roman" w:cs="Times New Roman"/>
+          <w:vertAlign w:val="subscript"/>
+          <w:lang w:val="tr-TR"/>
+        </w:rPr>
+        <w:t xml:space="preserve">2</w:t>
+      </w:r>
+      <w:r>
+        <w:rPr>
+          <w:rFonts w:ascii="Times New Roman" w:hAnsi="Times New Roman" w:cs="Times New Roman"/>
+          <w:lang w:val="tr-TR"/>
+        </w:rPr>
+        <w:t xml:space="preserve">O ⇌ H</w:t>
+      </w:r>
+      <w:r>
+        <w:rPr>
+          <w:rFonts w:ascii="Times New Roman" w:hAnsi="Times New Roman" w:cs="Times New Roman"/>
+          <w:vertAlign w:val="subscript"/>
+          <w:lang w:val="tr-TR"/>
+        </w:rPr>
+        <w:t xml:space="preserve">3</w:t>
+      </w:r>
+      <w:r>
+        <w:rPr>
+          <w:rFonts w:ascii="Times New Roman" w:hAnsi="Times New Roman" w:cs="Times New Roman"/>
+          <w:lang w:val="tr-TR"/>
+        </w:rPr>
+        <w:t xml:space="preserve">O</w:t>
+      </w:r>
+      <w:r>
+        <w:rPr>
+          <w:rFonts w:ascii="Times New Roman" w:hAnsi="Times New Roman" w:cs="Times New Roman"/>
+          <w:vertAlign w:val="superscript"/>
+          <w:lang w:val="tr-TR"/>
+        </w:rPr>
+        <w:t xml:space="preserve">+</w:t>
+      </w:r>
+      <w:r>
+        <w:rPr>
+          <w:rFonts w:ascii="Times New Roman" w:hAnsi="Times New Roman" w:cs="Times New Roman"/>
+          <w:lang w:val="tr-TR"/>
+        </w:rPr>
+        <w:t xml:space="preserve"> + OH</w:t>
+      </w:r>
+      <w:r>
+        <w:rPr>
+          <w:rFonts w:ascii="Times New Roman" w:hAnsi="Times New Roman" w:cs="Times New Roman"/>
+          <w:vertAlign w:val="superscript"/>
+          <w:lang w:val="tr-TR"/>
+        </w:rPr>
+        <w:t xml:space="preserve">−</w:t>
+      </w:r>
+      <w:r>
+        <w:rPr>
+          <w:rFonts w:ascii="Times New Roman" w:hAnsi="Times New Roman" w:cs="Times New Roman"/>
+          <w:lang w:val="tr-TR"/>
+        </w:rPr>
+        <w:t xml:space="preserve">. 25 °C’de K</w:t>
+      </w:r>
+      <w:r>
+        <w:rPr>
+          <w:rFonts w:ascii="Times New Roman" w:hAnsi="Times New Roman" w:cs="Times New Roman"/>
+          <w:vertAlign w:val="subscript"/>
+          <w:lang w:val="tr-TR"/>
+        </w:rPr>
+        <w:t xml:space="preserve">su</w:t>
+      </w:r>
+      <w:r>
+        <w:rPr>
+          <w:rFonts w:ascii="Times New Roman" w:hAnsi="Times New Roman" w:cs="Times New Roman"/>
+          <w:lang w:val="tr-TR"/>
+        </w:rPr>
+        <w:t xml:space="preserve"> = [H</w:t>
+      </w:r>
+      <w:r>
+        <w:rPr>
+          <w:rFonts w:ascii="Times New Roman" w:hAnsi="Times New Roman" w:cs="Times New Roman"/>
+          <w:vertAlign w:val="subscript"/>
+          <w:lang w:val="tr-TR"/>
+        </w:rPr>
+        <w:t xml:space="preserve">3</w:t>
+      </w:r>
+      <w:r>
+        <w:rPr>
+          <w:rFonts w:ascii="Times New Roman" w:hAnsi="Times New Roman" w:cs="Times New Roman"/>
+          <w:lang w:val="tr-TR"/>
+        </w:rPr>
+        <w:t xml:space="preserve">O</w:t>
+      </w:r>
+      <w:r>
+        <w:rPr>
+          <w:rFonts w:ascii="Times New Roman" w:hAnsi="Times New Roman" w:cs="Times New Roman"/>
+          <w:vertAlign w:val="superscript"/>
+          <w:lang w:val="tr-TR"/>
+        </w:rPr>
+        <w:t xml:space="preserve">+</w:t>
+      </w:r>
+      <w:r>
+        <w:rPr>
+          <w:rFonts w:ascii="Times New Roman" w:hAnsi="Times New Roman" w:cs="Times New Roman"/>
+          <w:lang w:val="tr-TR"/>
+        </w:rPr>
+        <w:t xml:space="preserve">][OH</w:t>
+      </w:r>
+      <w:r>
+        <w:rPr>
+          <w:rFonts w:ascii="Times New Roman" w:hAnsi="Times New Roman" w:cs="Times New Roman"/>
+          <w:vertAlign w:val="superscript"/>
+          <w:lang w:val="tr-TR"/>
+        </w:rPr>
+        <w:t xml:space="preserve">−</w:t>
+      </w:r>
+      <w:r>
+        <w:rPr>
+          <w:rFonts w:ascii="Times New Roman" w:hAnsi="Times New Roman" w:cs="Times New Roman"/>
+          <w:lang w:val="tr-TR"/>
+        </w:rPr>
+        <w:t xml:space="preserve">] = 1,0·10</w:t>
+      </w:r>
+      <w:r>
+        <w:rPr>
+          <w:rFonts w:ascii="Times New Roman" w:hAnsi="Times New Roman" w:cs="Times New Roman"/>
+          <w:vertAlign w:val="superscript"/>
+          <w:lang w:val="tr-TR"/>
+        </w:rPr>
+        <w:t xml:space="preserve">-14</w:t>
+      </w:r>
+      <w:r>
+        <w:rPr>
+          <w:rFonts w:ascii="Times New Roman" w:hAnsi="Times New Roman" w:cs="Times New Roman"/>
+          <w:lang w:val="tr-TR"/>
+        </w:rPr>
+        <w:t xml:space="preserve">’tür ve saf suda [H</w:t>
+      </w:r>
+      <w:r>
+        <w:rPr>
+          <w:rFonts w:ascii="Times New Roman" w:hAnsi="Times New Roman" w:cs="Times New Roman"/>
+          <w:vertAlign w:val="subscript"/>
+          <w:lang w:val="tr-TR"/>
+        </w:rPr>
+        <w:t xml:space="preserve">3</w:t>
+      </w:r>
+      <w:r>
+        <w:rPr>
+          <w:rFonts w:ascii="Times New Roman" w:hAnsi="Times New Roman" w:cs="Times New Roman"/>
+          <w:lang w:val="tr-TR"/>
+        </w:rPr>
+        <w:t xml:space="preserve">O</w:t>
+      </w:r>
+      <w:r>
+        <w:rPr>
+          <w:rFonts w:ascii="Times New Roman" w:hAnsi="Times New Roman" w:cs="Times New Roman"/>
+          <w:vertAlign w:val="superscript"/>
+          <w:lang w:val="tr-TR"/>
+        </w:rPr>
+        <w:t xml:space="preserve">+</w:t>
+      </w:r>
+      <w:r>
+        <w:rPr>
+          <w:rFonts w:ascii="Times New Roman" w:hAnsi="Times New Roman" w:cs="Times New Roman"/>
+          <w:lang w:val="tr-TR"/>
+        </w:rPr>
+        <w:t xml:space="preserve">] = [OH</w:t>
+      </w:r>
+      <w:r>
+        <w:rPr>
+          <w:rFonts w:ascii="Times New Roman" w:hAnsi="Times New Roman" w:cs="Times New Roman"/>
+          <w:vertAlign w:val="superscript"/>
+          <w:lang w:val="tr-TR"/>
+        </w:rPr>
+        <w:t xml:space="preserve">−</w:t>
+      </w:r>
+      <w:r>
+        <w:rPr>
+          <w:rFonts w:ascii="Times New Roman" w:hAnsi="Times New Roman" w:cs="Times New Roman"/>
+          <w:lang w:val="tr-TR"/>
+        </w:rPr>
+        <w:t xml:space="preserve">] = 1,0·10</w:t>
+      </w:r>
+      <w:r>
+        <w:rPr>
+          <w:rFonts w:ascii="Times New Roman" w:hAnsi="Times New Roman" w:cs="Times New Roman"/>
+          <w:vertAlign w:val="superscript"/>
+          <w:lang w:val="tr-TR"/>
+        </w:rPr>
+        <w:t xml:space="preserve">-7</w:t>
+      </w:r>
+      <w:r>
+        <w:rPr>
+          <w:rFonts w:ascii="Times New Roman" w:hAnsi="Times New Roman" w:cs="Times New Roman"/>
+          <w:lang w:val="tr-TR"/>
+        </w:rPr>
+        <w:t xml:space="preserve"> mol/L’dir. Çözeltilerin asitliği pH = −log[H</w:t>
+      </w:r>
+      <w:r>
+        <w:rPr>
+          <w:rFonts w:ascii="Times New Roman" w:hAnsi="Times New Roman" w:cs="Times New Roman"/>
+          <w:vertAlign w:val="subscript"/>
+          <w:lang w:val="tr-TR"/>
+        </w:rPr>
+        <w:t xml:space="preserve">3</w:t>
+      </w:r>
+      <w:r>
+        <w:rPr>
+          <w:rFonts w:ascii="Times New Roman" w:hAnsi="Times New Roman" w:cs="Times New Roman"/>
+          <w:lang w:val="tr-TR"/>
+        </w:rPr>
+        <w:t xml:space="preserve">O</w:t>
+      </w:r>
+      <w:r>
+        <w:rPr>
+          <w:rFonts w:ascii="Times New Roman" w:hAnsi="Times New Roman" w:cs="Times New Roman"/>
+          <w:vertAlign w:val="superscript"/>
+          <w:lang w:val="tr-TR"/>
+        </w:rPr>
+        <w:t xml:space="preserve">+</w:t>
+      </w:r>
+      <w:r>
+        <w:rPr>
+          <w:rFonts w:ascii="Times New Roman" w:hAnsi="Times New Roman" w:cs="Times New Roman"/>
+          <w:lang w:val="tr-TR"/>
+        </w:rPr>
+        <w:t xml:space="preserve">] ile ifade edilir; 25 °C’de pH + pOH = 14’tür.</w:t>
+      </w:r>
+    </w:p>
+    <w:p>
+      <w:pPr>
+        <w:jc w:val="center"/>
+      </w:pPr>
+      <w:r>
+        <w:drawing>
+          <wp:inline xmlns:a="http://schemas.openxmlformats.org/drawingml/2006/main" xmlns:pic="http://schemas.openxmlformats.org/drawingml/2006/picture">
+            <wp:extent cx="2151450" cy="2520000"/>
+            <wp:docPr id="900006" name="Picture 900006"/>
+            <wp:cNvGraphicFramePr>
+              <a:graphicFrameLocks noChangeAspect="1"/>
+            </wp:cNvGraphicFramePr>
+            <a:graphic>
+              <a:graphicData uri="http://schemas.openxmlformats.org/drawingml/2006/picture">
+                <pic:pic>
+                  <pic:nvPicPr>
+                    <pic:cNvPr id="0" name="2715446197_d.jpg"/>
+                    <pic:cNvPicPr/>
+                  </pic:nvPicPr>
+                  <pic:blipFill>
+                    <a:blip r:embed="rId13"/>
+                    <a:stretch>
+                      <a:fillRect/>
+                    </a:stretch>
+                  </pic:blipFill>
+                  <pic:spPr>
+                    <a:xfrm>
+                      <a:off x="0" y="0"/>
+                      <a:ext cx="2151450" cy="2520000"/>
+                    </a:xfrm>
+                    <a:prstGeom prst="rect"/>
+                  </pic:spPr>
+                </pic:pic>
+              </a:graphicData>
+            </a:graphic>
+          </wp:inline>
+        </w:drawing>
+      </w:r>
+    </w:p>
+    <w:p>
+      <w:pPr>
+        <w:jc w:val="center"/>
+      </w:pPr>
+      <w:r>
+        <w:rPr>
+          <w:rFonts w:ascii="Times New Roman" w:hAnsi="Times New Roman" w:cs="Times New Roman"/>
+          <w:b/>
+          <w:bCs/>
+          <w:highlight w:val="yellow"/>
+          <w:lang w:val="tr-TR"/>
+        </w:rPr>
+        <w:t xml:space="preserve">Shutter id: 2715446197</w:t>
+      </w:r>
+    </w:p>
+    <w:p>
+      <w:pPr>
+        <w:jc w:val="center"/>
+        <w:rPr>
+          <w:rFonts w:ascii="Times New Roman" w:hAnsi="Times New Roman" w:cs="Times New Roman"/>
+          <w:lang w:val="tr-TR"/>
+        </w:rPr>
+      </w:pPr>
+      <w:r>
+        <w:rPr>
+          <w:rFonts w:ascii="Times New Roman" w:hAnsi="Times New Roman" w:cs="Times New Roman"/>
+          <w:b/>
+          <w:bCs/>
+          <w:lang w:val="tr-TR"/>
+        </w:rPr>
         <w:t xml:space="preserve">Görsel:</w:t>
       </w:r>
       <w:r>
@@ -1196,85 +1144,59 @@
         <w:t xml:space="preserve">) eşitliğinden bulunur. Mide, ağız, diş ve cilt sağlığı için kullanılan ürünler seçilirken ürünlerin asidik ya da bazik özellikleri ve vücudun doğal pH dengesi dikkate alınmalıdır.</w:t>
       </w:r>
     </w:p>
-    <w:tbl>
-      <w:tblPr>
-        <w:tblW w:w="9000" w:type="dxa"/>
+    <w:p>
+      <w:pPr>
         <w:jc w:val="center"/>
-        <w:tblBorders>
-          <w:top w:val="single" w:sz="8" w:space="0" w:color="7F7F7F"/>
-          <w:left w:val="single" w:sz="8" w:space="0" w:color="7F7F7F"/>
-          <w:bottom w:val="single" w:sz="8" w:space="0" w:color="7F7F7F"/>
-          <w:right w:val="single" w:sz="8" w:space="0" w:color="7F7F7F"/>
-        </w:tblBorders>
-      </w:tblPr>
-      <w:tblGrid>
-        <w:gridCol w:w="9000"/>
-      </w:tblGrid>
-      <w:tr>
-        <w:tc>
-          <w:tcPr>
-            <w:tcW w:w="9000" w:type="dxa"/>
-            <w:shd w:val="clear" w:color="auto" w:fill="EDEDED"/>
-          </w:tcPr>
-          <w:p>
-            <w:pPr>
-              <w:jc w:val="both"/>
-              <w:rPr>
-                <w:rFonts w:ascii="Times New Roman" w:hAnsi="Times New Roman" w:cs="Times New Roman"/>
-                <w:lang w:val="tr-TR"/>
-              </w:rPr>
-            </w:pPr>
-            <w:r>
-              <w:rPr>
-                <w:rFonts w:ascii="Times New Roman" w:hAnsi="Times New Roman" w:cs="Times New Roman"/>
-                <w:lang w:val="tr-TR"/>
-              </w:rPr>
-              <w:t xml:space="preserve">GÖRSEL ALANI (Shutterstock)</w:t>
-            </w:r>
-          </w:p>
-          <w:p>
-            <w:pPr>
-              <w:jc w:val="both"/>
-              <w:rPr>
-                <w:rFonts w:ascii="Times New Roman" w:hAnsi="Times New Roman" w:cs="Times New Roman"/>
-                <w:lang w:val="tr-TR"/>
-              </w:rPr>
-            </w:pPr>
-            <w:r>
-              <w:rPr>
-                <w:rFonts w:ascii="Times New Roman" w:hAnsi="Times New Roman" w:cs="Times New Roman"/>
-                <w:lang w:val="tr-TR"/>
-              </w:rPr>
-              <w:t xml:space="preserve">Tarif: Büret, erlenmayer ve fenolftaleinli pembe çözeltiyi gösteren titrasyon düzeneği fotoğrafı.</w:t>
-            </w:r>
-          </w:p>
-          <w:p>
-            <w:pPr>
-              <w:jc w:val="both"/>
-              <w:rPr>
-                <w:rFonts w:ascii="Times New Roman" w:hAnsi="Times New Roman" w:cs="Times New Roman"/>
-                <w:lang w:val="tr-TR"/>
-              </w:rPr>
-            </w:pPr>
-            <w:r>
-              <w:rPr>
-                <w:rFonts w:ascii="Times New Roman" w:hAnsi="Times New Roman" w:cs="Times New Roman"/>
-                <w:lang w:val="tr-TR"/>
-              </w:rPr>
-              <w:t xml:space="preserve">Shutter ID: 2303124117 (fotoğraf) — Acid-base titration in laboratory</w:t>
-            </w:r>
-          </w:p>
-        </w:tc>
-      </w:tr>
-    </w:tbl>
-    <w:p>
-      <w:pPr>
-        <w:jc w:val="both"/>
-        <w:rPr>
-          <w:rFonts w:ascii="Times New Roman" w:hAnsi="Times New Roman" w:cs="Times New Roman"/>
-          <w:lang w:val="tr-TR"/>
-        </w:rPr>
-      </w:pPr>
+      </w:pPr>
+      <w:r>
+        <w:drawing>
+          <wp:inline xmlns:a="http://schemas.openxmlformats.org/drawingml/2006/main" xmlns:pic="http://schemas.openxmlformats.org/drawingml/2006/picture">
+            <wp:extent cx="3384064" cy="2520000"/>
+            <wp:docPr id="900007" name="Picture 900007"/>
+            <wp:cNvGraphicFramePr>
+              <a:graphicFrameLocks noChangeAspect="1"/>
+            </wp:cNvGraphicFramePr>
+            <a:graphic>
+              <a:graphicData uri="http://schemas.openxmlformats.org/drawingml/2006/picture">
+                <pic:pic>
+                  <pic:nvPicPr>
+                    <pic:cNvPr id="0" name="2303124117_d.jpg"/>
+                    <pic:cNvPicPr/>
+                  </pic:nvPicPr>
+                  <pic:blipFill>
+                    <a:blip r:embed="rId14"/>
+                    <a:stretch>
+                      <a:fillRect/>
+                    </a:stretch>
+                  </pic:blipFill>
+                  <pic:spPr>
+                    <a:xfrm>
+                      <a:off x="0" y="0"/>
+                      <a:ext cx="3384064" cy="2520000"/>
+                    </a:xfrm>
+                    <a:prstGeom prst="rect"/>
+                  </pic:spPr>
+                </pic:pic>
+              </a:graphicData>
+            </a:graphic>
+          </wp:inline>
+        </w:drawing>
+      </w:r>
+    </w:p>
+    <w:p>
+      <w:pPr>
+        <w:jc w:val="center"/>
+      </w:pPr>
+      <w:r>
+        <w:rPr>
+          <w:rFonts w:ascii="Times New Roman" w:hAnsi="Times New Roman" w:cs="Times New Roman"/>
+          <w:b/>
+          <w:bCs/>
+          <w:highlight w:val="yellow"/>
+          <w:lang w:val="tr-TR"/>
+        </w:rPr>
+        <w:t xml:space="preserve">Shutter id: 2303124117</w:t>
+      </w:r>
     </w:p>
     <w:p>
       <w:pPr>

</xml_diff>

<commit_message>
dijital tema 2: NO2/N2O4 tup gorseli alanina 2.1 icin cizilen tanecik gorunumlu tup cizimi kondu
</commit_message>
<xml_diff>
--- a/dijital/dijital_tema-2-kim11.docx
+++ b/dijital/dijital_tema-2-kim11.docx
@@ -136,138 +136,45 @@
         <w:t xml:space="preserve">Bazı kimyasal tepkimeler yalnızca ürünler yönünde ilerlerken bazı tepkimeler hem ileri hem de geri yönde gerçekleşebilir. Her iki yönde gerçekleşebilen tepkimelere tersinir tepkimeler denir ve çift yönlü okla (⇌) gösterilir. Tekrarlanabilen renk değişimi ya da bir katının oluşup yeniden çözünmesi gibi gözlemlenebilir nitelikler tepkimenin tersinir olduğunu gösterir.</w:t>
       </w:r>
     </w:p>
-    <w:tbl>
-      <w:tblPr>
-        <w:tblW w:w="9000" w:type="dxa"/>
+    <w:p>
+      <w:pPr>
         <w:jc w:val="center"/>
-        <w:tblBorders>
-          <w:top w:val="single" w:sz="8" w:space="0" w:color="7F7F7F"/>
-          <w:left w:val="single" w:sz="8" w:space="0" w:color="7F7F7F"/>
-          <w:bottom w:val="single" w:sz="8" w:space="0" w:color="7F7F7F"/>
-          <w:right w:val="single" w:sz="8" w:space="0" w:color="7F7F7F"/>
-        </w:tblBorders>
-      </w:tblPr>
-      <w:tblGrid>
-        <w:gridCol w:w="9000"/>
-      </w:tblGrid>
-      <w:tr>
-        <w:tc>
-          <w:tcPr>
-            <w:tcW w:w="9000" w:type="dxa"/>
-            <w:shd w:val="clear" w:color="auto" w:fill="EDEDED"/>
-          </w:tcPr>
-          <w:p>
-            <w:pPr>
-              <w:jc w:val="both"/>
-              <w:rPr>
-                <w:rFonts w:ascii="Times New Roman" w:hAnsi="Times New Roman" w:cs="Times New Roman"/>
-                <w:lang w:val="tr-TR"/>
-              </w:rPr>
-            </w:pPr>
-            <w:r>
-              <w:rPr>
-                <w:rFonts w:ascii="Times New Roman" w:hAnsi="Times New Roman" w:cs="Times New Roman"/>
-                <w:lang w:val="tr-TR"/>
-              </w:rPr>
-              <w:t xml:space="preserve">GÖRSEL ALANI</w:t>
-            </w:r>
-          </w:p>
-          <w:p>
-            <w:pPr>
-              <w:jc w:val="both"/>
-              <w:rPr>
-                <w:rFonts w:ascii="Times New Roman" w:hAnsi="Times New Roman" w:cs="Times New Roman"/>
-                <w:lang w:val="tr-TR"/>
-              </w:rPr>
-            </w:pPr>
-            <w:r>
-              <w:rPr>
-                <w:rFonts w:ascii="Times New Roman" w:hAnsi="Times New Roman" w:cs="Times New Roman"/>
-                <w:lang w:val="tr-TR"/>
-              </w:rPr>
-              <w:t xml:space="preserve">Tarif: Sıcak suda koyu kahverengi, buzlu suda açık renkli NO</w:t>
-            </w:r>
-            <w:r>
-              <w:rPr>
-                <w:rFonts w:ascii="Times New Roman" w:hAnsi="Times New Roman" w:cs="Times New Roman"/>
-                <w:vertAlign w:val="subscript"/>
-                <w:lang w:val="tr-TR"/>
-              </w:rPr>
-              <w:t xml:space="preserve">2</w:t>
-            </w:r>
-            <w:r>
-              <w:rPr>
-                <w:rFonts w:ascii="Times New Roman" w:hAnsi="Times New Roman" w:cs="Times New Roman"/>
-                <w:lang w:val="tr-TR"/>
-              </w:rPr>
-              <w:t xml:space="preserve">/N</w:t>
-            </w:r>
-            <w:r>
-              <w:rPr>
-                <w:rFonts w:ascii="Times New Roman" w:hAnsi="Times New Roman" w:cs="Times New Roman"/>
-                <w:vertAlign w:val="subscript"/>
-                <w:lang w:val="tr-TR"/>
-              </w:rPr>
-              <w:t xml:space="preserve">2</w:t>
-            </w:r>
-            <w:r>
-              <w:rPr>
-                <w:rFonts w:ascii="Times New Roman" w:hAnsi="Times New Roman" w:cs="Times New Roman"/>
-                <w:lang w:val="tr-TR"/>
-              </w:rPr>
-              <w:t xml:space="preserve">O</w:t>
-            </w:r>
-            <w:r>
-              <w:rPr>
-                <w:rFonts w:ascii="Times New Roman" w:hAnsi="Times New Roman" w:cs="Times New Roman"/>
-                <w:vertAlign w:val="subscript"/>
-                <w:lang w:val="tr-TR"/>
-              </w:rPr>
-              <w:t xml:space="preserve">4</w:t>
-            </w:r>
-            <w:r>
-              <w:rPr>
-                <w:rFonts w:ascii="Times New Roman" w:hAnsi="Times New Roman" w:cs="Times New Roman"/>
-                <w:lang w:val="tr-TR"/>
-              </w:rPr>
-              <w:t xml:space="preserve"> tüpleri (vektörel ya da fotoğraf).</w:t>
-            </w:r>
-          </w:p>
-          <w:p>
-            <w:pPr>
-              <w:jc w:val="both"/>
-              <w:rPr>
-                <w:rFonts w:ascii="Times New Roman" w:hAnsi="Times New Roman" w:cs="Times New Roman"/>
-                <w:lang w:val="tr-TR"/>
-              </w:rPr>
-            </w:pPr>
-            <w:r>
-              <w:rPr>
-                <w:rFonts w:ascii="Times New Roman" w:hAnsi="Times New Roman" w:cs="Times New Roman"/>
-                <w:lang w:val="tr-TR"/>
-              </w:rPr>
-              <w:t xml:space="preserve">Shutterstock arama: “nitrogen dioxide equilibrium hot cold”</w:t>
-            </w:r>
-          </w:p>
-          <w:p>
-            <w:pPr>
-              <w:jc w:val="both"/>
-              <w:rPr>
-                <w:rFonts w:ascii="Times New Roman" w:hAnsi="Times New Roman" w:cs="Times New Roman"/>
-                <w:lang w:val="tr-TR"/>
-              </w:rPr>
-            </w:pPr>
-            <w:r>
-              <w:rPr>
-                <w:rFonts w:ascii="Times New Roman" w:hAnsi="Times New Roman" w:cs="Times New Roman"/>
-                <w:lang w:val="tr-TR"/>
-              </w:rPr>
-              <w:t xml:space="preserve">Shutter ID: Ticari kullanıma uygun NO2/N2O4 tüp görseli bulunamadı; yayınevi vektörel çizmeli.</w:t>
-            </w:r>
-          </w:p>
-        </w:tc>
-      </w:tr>
-    </w:tbl>
+      </w:pPr>
+      <w:r>
+        <w:drawing>
+          <wp:inline xmlns:a="http://schemas.openxmlformats.org/drawingml/2006/main" xmlns:pic="http://schemas.openxmlformats.org/drawingml/2006/picture">
+            <wp:extent cx="3960000" cy="3667892"/>
+            <wp:docPr id="900008" name="Picture 900008"/>
+            <wp:cNvGraphicFramePr>
+              <a:graphicFrameLocks noChangeAspect="1"/>
+            </wp:cNvGraphicFramePr>
+            <a:graphic>
+              <a:graphicData uri="http://schemas.openxmlformats.org/drawingml/2006/picture">
+                <pic:pic>
+                  <pic:nvPicPr>
+                    <pic:cNvPr id="0" name="k11_21_NO2_N2O4_tupler.png"/>
+                    <pic:cNvPicPr/>
+                  </pic:nvPicPr>
+                  <pic:blipFill>
+                    <a:blip r:embed="rId15"/>
+                    <a:stretch>
+                      <a:fillRect/>
+                    </a:stretch>
+                  </pic:blipFill>
+                  <pic:spPr>
+                    <a:xfrm>
+                      <a:off x="0" y="0"/>
+                      <a:ext cx="3960000" cy="3667892"/>
+                    </a:xfrm>
+                    <a:prstGeom prst="rect"/>
+                  </pic:spPr>
+                </pic:pic>
+              </a:graphicData>
+            </a:graphic>
+          </wp:inline>
+        </w:drawing>
+      </w:r>
+    </w:p>
     <w:p>
       <w:pPr>
         <w:jc w:val="both"/>

</xml_diff>